<commit_message>
Add new binary files for thesis documentation
- Introduced new DOCX and PDF files for the thesis, enhancing the documentation with updated content.
- Ensured that the new files align with the existing structure and formatting of the thesis project.
</commit_message>
<xml_diff>
--- a/thesis/docx/Титульный лист.docx
+++ b/thesis/docx/Титульный лист.docx
@@ -413,7 +413,6 @@
           <w:rFonts w:ascii="Times New Roman" w:hAnsi="Times New Roman" w:cs="Times New Roman"/>
           <w:sz w:val="28"/>
           <w:szCs w:val="28"/>
-          <w:lang w:val="en-US"/>
         </w:rPr>
       </w:pPr>
     </w:p>
@@ -575,7 +574,7 @@
             <w:pPr>
               <w:rPr>
                 <w:rFonts w:ascii="Times New Roman" w:hAnsi="Times New Roman" w:cs="Times New Roman"/>
-                <w:i/>
+                <w:iCs/>
                 <w:sz w:val="24"/>
                 <w:szCs w:val="24"/>
               </w:rPr>
@@ -583,16 +582,20 @@
             <w:proofErr w:type="spellStart"/>
             <w:r>
               <w:rPr>
-                <w:rFonts w:ascii="Arial" w:hAnsi="Arial" w:cs="Arial"/>
-                <w:color w:val="000000"/>
+                <w:rFonts w:ascii="Times New Roman" w:hAnsi="Times New Roman" w:cs="Times New Roman"/>
+                <w:iCs/>
+                <w:sz w:val="24"/>
+                <w:szCs w:val="24"/>
               </w:rPr>
               <w:t>Нахатакяна</w:t>
             </w:r>
             <w:proofErr w:type="spellEnd"/>
             <w:r>
               <w:rPr>
-                <w:rFonts w:ascii="Arial" w:hAnsi="Arial" w:cs="Arial"/>
-                <w:color w:val="000000"/>
+                <w:rFonts w:ascii="Times New Roman" w:hAnsi="Times New Roman" w:cs="Times New Roman"/>
+                <w:iCs/>
+                <w:sz w:val="24"/>
+                <w:szCs w:val="24"/>
               </w:rPr>
               <w:t xml:space="preserve"> Артура Романовича</w:t>
             </w:r>

</xml_diff>